<commit_message>
Day9-Interviewer: guard both chat calls against failure, add project.md
Both GetChatMessageContentAsync calls (priming call and the in-loop
call) were unguarded - a network blip, rate limit, or safety-filter
rejection would crash the whole session mid-interview. Wraps both in
try/catch and adds a null-guard on the priming response matching the
loop's existing pattern. Syncs the docx's Complete Code listing and
replaces missing.md with project.md.
</commit_message>
<xml_diff>
--- a/Day9-Interviewer.docx
+++ b/Day9-Interviewer.docx
@@ -1066,39 +1066,279 @@
           <w:rFonts w:ascii="Consolas" w:hAnsi="Consolas"/>
           <w:sz w:val="19"/>
         </w:rPr>
-        <w:t xml:space="preserve">            var response = await chatService.GetChatMessageContentAsync(chatHistory, executionSettings, kernel: kernel);</w:t>
-      </w:r>
-    </w:p>
-    <w:p>
-      <w:pPr>
-        <w:pStyle w:val="NoSpacing"/>
-        <w:rPr>
-          <w:rFonts w:ascii="Consolas" w:hAnsi="Consolas"/>
-          <w:sz w:val="19"/>
-        </w:rPr>
-      </w:pPr>
-      <w:r>
-        <w:rPr>
-          <w:rFonts w:ascii="Consolas" w:hAnsi="Consolas"/>
-          <w:sz w:val="19"/>
-        </w:rPr>
-        <w:t xml:space="preserve">            Console.WriteLine($"Interviewer: {response.Content}");</w:t>
-      </w:r>
-    </w:p>
-    <w:p>
-      <w:pPr>
-        <w:pStyle w:val="NoSpacing"/>
-        <w:rPr>
-          <w:rFonts w:ascii="Consolas" w:hAnsi="Consolas"/>
-          <w:sz w:val="19"/>
-        </w:rPr>
-      </w:pPr>
-      <w:r>
-        <w:rPr>
-          <w:rFonts w:ascii="Consolas" w:hAnsi="Consolas"/>
-          <w:sz w:val="19"/>
-        </w:rPr>
-        <w:t xml:space="preserve">            chatHistory.AddAssistantMessage(response.Content);</w:t>
+        <w:t xml:space="preserve">            ChatMessageContent response;</w:t>
+      </w:r>
+    </w:p>
+    <w:p>
+      <w:pPr>
+        <w:pStyle w:val="NoSpacing"/>
+        <w:rPr>
+          <w:rFonts w:ascii="Consolas" w:hAnsi="Consolas"/>
+          <w:sz w:val="19"/>
+        </w:rPr>
+      </w:pPr>
+      <w:r>
+        <w:rPr>
+          <w:rFonts w:ascii="Consolas" w:hAnsi="Consolas"/>
+          <w:sz w:val="19"/>
+        </w:rPr>
+        <w:t xml:space="preserve">            try</w:t>
+      </w:r>
+    </w:p>
+    <w:p>
+      <w:pPr>
+        <w:pStyle w:val="NoSpacing"/>
+        <w:rPr>
+          <w:rFonts w:ascii="Consolas" w:hAnsi="Consolas"/>
+          <w:sz w:val="19"/>
+        </w:rPr>
+      </w:pPr>
+      <w:r>
+        <w:rPr>
+          <w:rFonts w:ascii="Consolas" w:hAnsi="Consolas"/>
+          <w:sz w:val="19"/>
+        </w:rPr>
+        <w:t xml:space="preserve">            {</w:t>
+      </w:r>
+    </w:p>
+    <w:p>
+      <w:pPr>
+        <w:pStyle w:val="NoSpacing"/>
+        <w:rPr>
+          <w:rFonts w:ascii="Consolas" w:hAnsi="Consolas"/>
+          <w:sz w:val="19"/>
+        </w:rPr>
+      </w:pPr>
+      <w:r>
+        <w:rPr>
+          <w:rFonts w:ascii="Consolas" w:hAnsi="Consolas"/>
+          <w:sz w:val="19"/>
+        </w:rPr>
+        <w:t xml:space="preserve">                response = await chatService.GetChatMessageContentAsync(chatHistory, executionSettings, kernel: kernel);</w:t>
+      </w:r>
+    </w:p>
+    <w:p>
+      <w:pPr>
+        <w:pStyle w:val="NoSpacing"/>
+        <w:rPr>
+          <w:rFonts w:ascii="Consolas" w:hAnsi="Consolas"/>
+          <w:sz w:val="19"/>
+        </w:rPr>
+      </w:pPr>
+      <w:r>
+        <w:rPr>
+          <w:rFonts w:ascii="Consolas" w:hAnsi="Consolas"/>
+          <w:sz w:val="19"/>
+        </w:rPr>
+        <w:t xml:space="preserve">            }</w:t>
+      </w:r>
+    </w:p>
+    <w:p>
+      <w:pPr>
+        <w:pStyle w:val="NoSpacing"/>
+        <w:rPr>
+          <w:rFonts w:ascii="Consolas" w:hAnsi="Consolas"/>
+          <w:sz w:val="19"/>
+        </w:rPr>
+      </w:pPr>
+      <w:r>
+        <w:rPr>
+          <w:rFonts w:ascii="Consolas" w:hAnsi="Consolas"/>
+          <w:sz w:val="19"/>
+        </w:rPr>
+        <w:t xml:space="preserve">            catch (Exception ex)</w:t>
+      </w:r>
+    </w:p>
+    <w:p>
+      <w:pPr>
+        <w:pStyle w:val="NoSpacing"/>
+        <w:rPr>
+          <w:rFonts w:ascii="Consolas" w:hAnsi="Consolas"/>
+          <w:sz w:val="19"/>
+        </w:rPr>
+      </w:pPr>
+      <w:r>
+        <w:rPr>
+          <w:rFonts w:ascii="Consolas" w:hAnsi="Consolas"/>
+          <w:sz w:val="19"/>
+        </w:rPr>
+        <w:t xml:space="preserve">            {</w:t>
+      </w:r>
+    </w:p>
+    <w:p>
+      <w:pPr>
+        <w:pStyle w:val="NoSpacing"/>
+        <w:rPr>
+          <w:rFonts w:ascii="Consolas" w:hAnsi="Consolas"/>
+          <w:sz w:val="19"/>
+        </w:rPr>
+      </w:pPr>
+      <w:r>
+        <w:rPr>
+          <w:rFonts w:ascii="Consolas" w:hAnsi="Consolas"/>
+          <w:sz w:val="19"/>
+        </w:rPr>
+        <w:t xml:space="preserve">                // Step: An unguarded API failure here would crash the app before the interview even starts.</w:t>
+      </w:r>
+    </w:p>
+    <w:p>
+      <w:pPr>
+        <w:pStyle w:val="NoSpacing"/>
+        <w:rPr>
+          <w:rFonts w:ascii="Consolas" w:hAnsi="Consolas"/>
+          <w:sz w:val="19"/>
+        </w:rPr>
+      </w:pPr>
+      <w:r>
+        <w:rPr>
+          <w:rFonts w:ascii="Consolas" w:hAnsi="Consolas"/>
+          <w:sz w:val="19"/>
+        </w:rPr>
+        <w:t xml:space="preserve">                Console.WriteLine($"The interviewer is unavailable right now: {ex.Message}");</w:t>
+      </w:r>
+    </w:p>
+    <w:p>
+      <w:pPr>
+        <w:pStyle w:val="NoSpacing"/>
+        <w:rPr>
+          <w:rFonts w:ascii="Consolas" w:hAnsi="Consolas"/>
+          <w:sz w:val="19"/>
+        </w:rPr>
+      </w:pPr>
+      <w:r>
+        <w:rPr>
+          <w:rFonts w:ascii="Consolas" w:hAnsi="Consolas"/>
+          <w:sz w:val="19"/>
+        </w:rPr>
+        <w:t xml:space="preserve">                return;</w:t>
+      </w:r>
+    </w:p>
+    <w:p>
+      <w:pPr>
+        <w:pStyle w:val="NoSpacing"/>
+        <w:rPr>
+          <w:rFonts w:ascii="Consolas" w:hAnsi="Consolas"/>
+          <w:sz w:val="19"/>
+        </w:rPr>
+      </w:pPr>
+      <w:r>
+        <w:rPr>
+          <w:rFonts w:ascii="Consolas" w:hAnsi="Consolas"/>
+          <w:sz w:val="19"/>
+        </w:rPr>
+        <w:t xml:space="preserve">            }</w:t>
+      </w:r>
+    </w:p>
+    <w:p>
+      <w:pPr>
+        <w:pStyle w:val="NoSpacing"/>
+        <w:rPr>
+          <w:rFonts w:ascii="Consolas" w:hAnsi="Consolas"/>
+          <w:sz w:val="19"/>
+        </w:rPr>
+      </w:pPr>
+      <w:r>
+        <w:rPr>
+          <w:rFonts w:ascii="Consolas" w:hAnsi="Consolas"/>
+          <w:sz w:val="19"/>
+        </w:rPr>
+        <w:t xml:space="preserve">            // Step: Guard against a null/empty first response the same way the loop below already does,</w:t>
+      </w:r>
+    </w:p>
+    <w:p>
+      <w:pPr>
+        <w:pStyle w:val="NoSpacing"/>
+        <w:rPr>
+          <w:rFonts w:ascii="Consolas" w:hAnsi="Consolas"/>
+          <w:sz w:val="19"/>
+        </w:rPr>
+      </w:pPr>
+      <w:r>
+        <w:rPr>
+          <w:rFonts w:ascii="Consolas" w:hAnsi="Consolas"/>
+          <w:sz w:val="19"/>
+        </w:rPr>
+        <w:t xml:space="preserve">            // since AddAssistantMessage requires a non-null string.</w:t>
+      </w:r>
+    </w:p>
+    <w:p>
+      <w:pPr>
+        <w:pStyle w:val="NoSpacing"/>
+        <w:rPr>
+          <w:rFonts w:ascii="Consolas" w:hAnsi="Consolas"/>
+          <w:sz w:val="19"/>
+        </w:rPr>
+      </w:pPr>
+      <w:r>
+        <w:rPr>
+          <w:rFonts w:ascii="Consolas" w:hAnsi="Consolas"/>
+          <w:sz w:val="19"/>
+        </w:rPr>
+        <w:t xml:space="preserve">            if (response.Content != null)</w:t>
+      </w:r>
+    </w:p>
+    <w:p>
+      <w:pPr>
+        <w:pStyle w:val="NoSpacing"/>
+        <w:rPr>
+          <w:rFonts w:ascii="Consolas" w:hAnsi="Consolas"/>
+          <w:sz w:val="19"/>
+        </w:rPr>
+      </w:pPr>
+      <w:r>
+        <w:rPr>
+          <w:rFonts w:ascii="Consolas" w:hAnsi="Consolas"/>
+          <w:sz w:val="19"/>
+        </w:rPr>
+        <w:t xml:space="preserve">            {</w:t>
+      </w:r>
+    </w:p>
+    <w:p>
+      <w:pPr>
+        <w:pStyle w:val="NoSpacing"/>
+        <w:rPr>
+          <w:rFonts w:ascii="Consolas" w:hAnsi="Consolas"/>
+          <w:sz w:val="19"/>
+        </w:rPr>
+      </w:pPr>
+      <w:r>
+        <w:rPr>
+          <w:rFonts w:ascii="Consolas" w:hAnsi="Consolas"/>
+          <w:sz w:val="19"/>
+        </w:rPr>
+        <w:t xml:space="preserve">                Console.WriteLine($"Interviewer: {response.Content}");</w:t>
+      </w:r>
+    </w:p>
+    <w:p>
+      <w:pPr>
+        <w:pStyle w:val="NoSpacing"/>
+        <w:rPr>
+          <w:rFonts w:ascii="Consolas" w:hAnsi="Consolas"/>
+          <w:sz w:val="19"/>
+        </w:rPr>
+      </w:pPr>
+      <w:r>
+        <w:rPr>
+          <w:rFonts w:ascii="Consolas" w:hAnsi="Consolas"/>
+          <w:sz w:val="19"/>
+        </w:rPr>
+        <w:t xml:space="preserve">                chatHistory.AddAssistantMessage(response.Content);</w:t>
+      </w:r>
+    </w:p>
+    <w:p>
+      <w:pPr>
+        <w:pStyle w:val="NoSpacing"/>
+        <w:rPr>
+          <w:rFonts w:ascii="Consolas" w:hAnsi="Consolas"/>
+          <w:sz w:val="19"/>
+        </w:rPr>
+      </w:pPr>
+      <w:r>
+        <w:rPr>
+          <w:rFonts w:ascii="Consolas" w:hAnsi="Consolas"/>
+          <w:sz w:val="19"/>
+        </w:rPr>
+        <w:t xml:space="preserve">            }</w:t>
       </w:r>
     </w:p>
     <w:p>
@@ -1171,6 +1411,7 @@
           <w:rFonts w:ascii="Consolas" w:hAnsi="Consolas"/>
           <w:sz w:val="19"/>
         </w:rPr>
+        <w:lastRenderedPageBreak/>
         <w:t xml:space="preserve">                Console.Write("\nCandidate: ");</w:t>
       </w:r>
     </w:p>
@@ -1310,7 +1551,183 @@
           <w:rFonts w:ascii="Consolas" w:hAnsi="Consolas"/>
           <w:sz w:val="19"/>
         </w:rPr>
-        <w:t xml:space="preserve">                var nextQuestion = await chatService.GetChatMessageContentAsync(chatHistory, executionSettings, kernel: kernel);</w:t>
+        <w:t xml:space="preserve">                ChatMessageContent nextQuestion;</w:t>
+      </w:r>
+    </w:p>
+    <w:p>
+      <w:pPr>
+        <w:pStyle w:val="NoSpacing"/>
+        <w:rPr>
+          <w:rFonts w:ascii="Consolas" w:hAnsi="Consolas"/>
+          <w:sz w:val="19"/>
+        </w:rPr>
+      </w:pPr>
+      <w:r>
+        <w:rPr>
+          <w:rFonts w:ascii="Consolas" w:hAnsi="Consolas"/>
+          <w:sz w:val="19"/>
+        </w:rPr>
+        <w:t xml:space="preserve">                try</w:t>
+      </w:r>
+    </w:p>
+    <w:p>
+      <w:pPr>
+        <w:pStyle w:val="NoSpacing"/>
+        <w:rPr>
+          <w:rFonts w:ascii="Consolas" w:hAnsi="Consolas"/>
+          <w:sz w:val="19"/>
+        </w:rPr>
+      </w:pPr>
+      <w:r>
+        <w:rPr>
+          <w:rFonts w:ascii="Consolas" w:hAnsi="Consolas"/>
+          <w:sz w:val="19"/>
+        </w:rPr>
+        <w:t xml:space="preserve">                {</w:t>
+      </w:r>
+    </w:p>
+    <w:p>
+      <w:pPr>
+        <w:pStyle w:val="NoSpacing"/>
+        <w:rPr>
+          <w:rFonts w:ascii="Consolas" w:hAnsi="Consolas"/>
+          <w:sz w:val="19"/>
+        </w:rPr>
+      </w:pPr>
+      <w:r>
+        <w:rPr>
+          <w:rFonts w:ascii="Consolas" w:hAnsi="Consolas"/>
+          <w:sz w:val="19"/>
+        </w:rPr>
+        <w:t xml:space="preserve">                    nextQuestion = await chatService.GetChatMessageContentAsync(chatHistory, executionSettings, kernel: kernel);</w:t>
+      </w:r>
+    </w:p>
+    <w:p>
+      <w:pPr>
+        <w:pStyle w:val="NoSpacing"/>
+        <w:rPr>
+          <w:rFonts w:ascii="Consolas" w:hAnsi="Consolas"/>
+          <w:sz w:val="19"/>
+        </w:rPr>
+      </w:pPr>
+      <w:r>
+        <w:rPr>
+          <w:rFonts w:ascii="Consolas" w:hAnsi="Consolas"/>
+          <w:sz w:val="19"/>
+        </w:rPr>
+        <w:t xml:space="preserve">                }</w:t>
+      </w:r>
+    </w:p>
+    <w:p>
+      <w:pPr>
+        <w:pStyle w:val="NoSpacing"/>
+        <w:rPr>
+          <w:rFonts w:ascii="Consolas" w:hAnsi="Consolas"/>
+          <w:sz w:val="19"/>
+        </w:rPr>
+      </w:pPr>
+      <w:r>
+        <w:rPr>
+          <w:rFonts w:ascii="Consolas" w:hAnsi="Consolas"/>
+          <w:sz w:val="19"/>
+        </w:rPr>
+        <w:t xml:space="preserve">                catch (Exception ex)</w:t>
+      </w:r>
+    </w:p>
+    <w:p>
+      <w:pPr>
+        <w:pStyle w:val="NoSpacing"/>
+        <w:rPr>
+          <w:rFonts w:ascii="Consolas" w:hAnsi="Consolas"/>
+          <w:sz w:val="19"/>
+        </w:rPr>
+      </w:pPr>
+      <w:r>
+        <w:rPr>
+          <w:rFonts w:ascii="Consolas" w:hAnsi="Consolas"/>
+          <w:sz w:val="19"/>
+        </w:rPr>
+        <w:t xml:space="preserve">                {</w:t>
+      </w:r>
+    </w:p>
+    <w:p>
+      <w:pPr>
+        <w:pStyle w:val="NoSpacing"/>
+        <w:rPr>
+          <w:rFonts w:ascii="Consolas" w:hAnsi="Consolas"/>
+          <w:sz w:val="19"/>
+        </w:rPr>
+      </w:pPr>
+      <w:r>
+        <w:rPr>
+          <w:rFonts w:ascii="Consolas" w:hAnsi="Consolas"/>
+          <w:sz w:val="19"/>
+        </w:rPr>
+        <w:t xml:space="preserve">                    // Step: A transient API failure shouldn't end the interview -</w:t>
+      </w:r>
+    </w:p>
+    <w:p>
+      <w:pPr>
+        <w:pStyle w:val="NoSpacing"/>
+        <w:rPr>
+          <w:rFonts w:ascii="Consolas" w:hAnsi="Consolas"/>
+          <w:sz w:val="19"/>
+        </w:rPr>
+      </w:pPr>
+      <w:r>
+        <w:rPr>
+          <w:rFonts w:ascii="Consolas" w:hAnsi="Consolas"/>
+          <w:sz w:val="19"/>
+        </w:rPr>
+        <w:t xml:space="preserve">                    // keep chatHistory intact and let the candidate retry.</w:t>
+      </w:r>
+    </w:p>
+    <w:p>
+      <w:pPr>
+        <w:pStyle w:val="NoSpacing"/>
+        <w:rPr>
+          <w:rFonts w:ascii="Consolas" w:hAnsi="Consolas"/>
+          <w:sz w:val="19"/>
+        </w:rPr>
+      </w:pPr>
+      <w:r>
+        <w:rPr>
+          <w:rFonts w:ascii="Consolas" w:hAnsi="Consolas"/>
+          <w:sz w:val="19"/>
+        </w:rPr>
+        <w:t xml:space="preserve">                    Console.WriteLine($"\nThe interviewer is momentarily unavailable ({ex.Message}). Please try again.");</w:t>
+      </w:r>
+    </w:p>
+    <w:p>
+      <w:pPr>
+        <w:pStyle w:val="NoSpacing"/>
+        <w:rPr>
+          <w:rFonts w:ascii="Consolas" w:hAnsi="Consolas"/>
+          <w:sz w:val="19"/>
+        </w:rPr>
+      </w:pPr>
+      <w:r>
+        <w:rPr>
+          <w:rFonts w:ascii="Consolas" w:hAnsi="Consolas"/>
+          <w:sz w:val="19"/>
+        </w:rPr>
+        <w:t xml:space="preserve">                    continue;</w:t>
+      </w:r>
+    </w:p>
+    <w:p>
+      <w:pPr>
+        <w:pStyle w:val="NoSpacing"/>
+        <w:rPr>
+          <w:rFonts w:ascii="Consolas" w:hAnsi="Consolas"/>
+          <w:sz w:val="19"/>
+        </w:rPr>
+      </w:pPr>
+      <w:r>
+        <w:rPr>
+          <w:rFonts w:ascii="Consolas" w:hAnsi="Consolas"/>
+          <w:sz w:val="19"/>
+        </w:rPr>
+        <w:t xml:space="preserve">                }</w:t>
       </w:r>
     </w:p>
     <w:p>
@@ -1511,7 +1928,11 @@
         <w:t>Step 2: A System Prompt That Is Also a Specification.</w:t>
       </w:r>
       <w:r>
-        <w:t xml:space="preserve"> The `ChatHistory` constructor is given a long system message that reads less like a casual instruction and more like a small spec: a role, a goal, and five numbered rules governing turn-taking, probing behavior, difficulty escalation, tone, and how to open the conversation. This is the central lesson of Day 9 — a system prompt isn't just "be nice," it can encode fairly precise behavioral constraints, and the model will generally follow them turn after turn without those rules needing to be repeated.</w:t>
+        <w:t xml:space="preserve"> The `ChatHistory` constructor is given a long system message that reads less like a casual instruction and more like a small spec: a role, a goal, and five numbered rules governing turn-taking, probing behavior, difficulty escalation, tone, and how to open the conversation. This is the central lesson of Day 9 — a system prompt isn't just "be nice," it can encode fairly precise behavioral </w:t>
+      </w:r>
+      <w:r>
+        <w:lastRenderedPageBreak/>
+        <w:t>constraints, and the model will generally follow them turn after turn without those rules needing to be repeated.</w:t>
       </w:r>
     </w:p>
     <w:p/>
@@ -1600,6 +2021,7 @@
           <w:rFonts w:ascii="Consolas" w:hAnsi="Consolas"/>
           <w:sz w:val="19"/>
         </w:rPr>
+        <w:lastRenderedPageBreak/>
         <w:t>Interviewer: Good afternoon, and thank you for joining me. I'm a senior .NET architect here to evaluate your understanding of agentic AI and Semantic Kernel. Let's start with something foundational: can you explain, in your own words, what the Semantic Kernel `Kernel` object is responsible for in an application?</w:t>
       </w:r>
     </w:p>

</xml_diff>